<commit_message>
fix: regenerate diagrams using project SVG runtime (grayscale style)
Replace Mermaid/Kroki-generated colored diagrams with properly styled
grayscale diagrams using the thesis-studio SVG runtime engine:
- Class diagram: 1400x680, 8-bit grayscale
- Login sequence: 1400x720, 8-bit grayscale
- Enroll sequence: 1400x680, 8-bit grayscale
- Business flow: 1000x1520, 8-bit grayscale

All diagrams now match the existing project diagram style (灰度+中文标注).

Co-Authored-By: Claude Opus 4.6 (1M context) <noreply@anthropic.com>
</commit_message>
<xml_diff>
--- a/papers/zhixue/output_v2.docx
+++ b/papers/zhixue/output_v2.docx
@@ -12511,7 +12511,7 @@
       <w:r>
         <w:drawing>
           <wp:inline xmlns:a="http://schemas.openxmlformats.org/drawingml/2006/main" xmlns:pic="http://schemas.openxmlformats.org/drawingml/2006/picture">
-            <wp:extent cx="5040000" cy="4832107"/>
+            <wp:extent cx="5040000" cy="2448000"/>
             <wp:docPr id="1004" name="Picture 16"/>
             <wp:cNvGraphicFramePr>
               <a:graphicFrameLocks noChangeAspect="1"/>
@@ -12532,7 +12532,7 @@
                   <pic:spPr>
                     <a:xfrm>
                       <a:off x="0" y="0"/>
-                      <a:ext cx="5040000" cy="4832107"/>
+                      <a:ext cx="5040000" cy="2448000"/>
                     </a:xfrm>
                     <a:prstGeom prst="rect"/>
                   </pic:spPr>
@@ -12971,7 +12971,7 @@
       <w:r>
         <w:drawing>
           <wp:inline xmlns:a="http://schemas.openxmlformats.org/drawingml/2006/main" xmlns:pic="http://schemas.openxmlformats.org/drawingml/2006/picture">
-            <wp:extent cx="3600000" cy="16592360"/>
+            <wp:extent cx="3600000" cy="5472000"/>
             <wp:docPr id="1005" name="Picture 16"/>
             <wp:cNvGraphicFramePr>
               <a:graphicFrameLocks noChangeAspect="1"/>
@@ -12992,7 +12992,7 @@
                   <pic:spPr>
                     <a:xfrm>
                       <a:off x="0" y="0"/>
-                      <a:ext cx="3600000" cy="16592360"/>
+                      <a:ext cx="3600000" cy="5472000"/>
                     </a:xfrm>
                     <a:prstGeom prst="rect"/>
                   </pic:spPr>
@@ -14293,6 +14293,86 @@
     </w:p>
     <w:p>
       <w:pPr>
+        <w:keepNext w:val="0"/>
+        <w:keepLines w:val="0"/>
+        <w:pageBreakBefore w:val="0"/>
+        <w:widowControl w:val="0"/>
+        <w:kinsoku/>
+        <w:wordWrap/>
+        <w:overflowPunct/>
+        <w:topLinePunct w:val="0"/>
+        <w:autoSpaceDE/>
+        <w:autoSpaceDN/>
+        <w:bidi w:val="0"/>
+        <w:adjustRightInd/>
+        <w:snapToGrid/>
+        <w:spacing w:line="312" w:lineRule="auto"/>
+        <w:ind w:firstLine="480" w:firstLineChars="200"/>
+        <w:jc w:val="center"/>
+        <w:textAlignment w:val="auto"/>
+        <w:rPr>
+          <w:rFonts w:hint="eastAsia" w:ascii="宋体" w:hAnsi="宋体" w:eastAsia="宋体" w:cs="宋体"/>
+          <w:b w:val="0"/>
+          <w:bCs/>
+          <w:color w:val="FF0000"/>
+          <w:sz w:val="24"/>
+          <w:szCs w:val="24"/>
+          <w:highlight w:val="none"/>
+          <w:lang w:val="en-US" w:eastAsia="zh-CN"/>
+        </w:rPr>
+      </w:pPr>
+      <w:r>
+        <w:rPr>
+          <w:rFonts w:hint="eastAsia" w:ascii="宋体" w:hAnsi="宋体" w:eastAsia="宋体" w:cs="宋体"/>
+          <w:b w:val="0"/>
+          <w:bCs/>
+          <w:color w:val="000000"/>
+          <w:sz w:val="21"/>
+          <w:szCs w:val="24"/>
+          <w:highlight w:val="none"/>
+          <w:lang w:val="en-US" w:eastAsia="zh-CN"/>
+        </w:rPr>
+        <w:t xml:space="preserve">图4-2展示了系统的功能模块划分，六个Module各自独立，认证模块作为全局依赖被其他模块引用。</w:t>
+      </w:r>
+      <w:r>
+        <w:rPr>
+          <w:rFonts w:hint="eastAsia" w:ascii="Times New Roman" w:hAnsi="Times New Roman" w:eastAsia="宋体" w:cs="Times New Roman"/>
+          <w:color w:val="FF0000"/>
+          <w:sz w:val="21"/>
+          <w:highlight w:val="none"/>
+          <w:lang w:val="en-US" w:eastAsia="zh-CN"/>
+        </w:rPr>
+      </w:r>
+      <w:r>
+        <w:rPr>
+          <w:rFonts w:hint="eastAsia" w:eastAsia="宋体" w:cs="Times New Roman"/>
+          <w:color w:val="FF0000"/>
+          <w:sz w:val="21"/>
+          <w:highlight w:val="none"/>
+          <w:lang w:val="en-US" w:eastAsia="zh-CN"/>
+        </w:rPr>
+      </w:r>
+      <w:r>
+        <w:rPr>
+          <w:rFonts w:hint="eastAsia" w:ascii="Times New Roman" w:hAnsi="Times New Roman" w:eastAsia="宋体" w:cs="Times New Roman"/>
+          <w:color w:val="FF0000"/>
+          <w:sz w:val="21"/>
+          <w:highlight w:val="none"/>
+          <w:lang w:val="en-US" w:eastAsia="zh-CN"/>
+        </w:rPr>
+      </w:r>
+      <w:r>
+        <w:rPr>
+          <w:rFonts w:hint="eastAsia" w:eastAsia="宋体" w:cs="Times New Roman"/>
+          <w:color w:val="FF0000"/>
+          <w:sz w:val="21"/>
+          <w:highlight w:val="none"/>
+          <w:lang w:val="en-US" w:eastAsia="zh-CN"/>
+        </w:rPr>
+      </w:r>
+    </w:p>
+    <w:p>
+      <w:pPr>
         <w:pStyle w:val="4"/>
         <w:bidi w:val="0"/>
         <w:rPr>
@@ -16262,7 +16342,7 @@
           <w:highlight w:val="none"/>
           <w:lang w:val="en-US" w:eastAsia="zh-CN"/>
         </w:rPr>
-        <w:t xml:space="preserve">上述表结构遵循第三范式（3NF）。每张表的非主键字段都直接依赖于主键，不存在传递依赖。Course表中teacher_name在当前系统里不作为独立实体管理，不需要拆Teacher表。Comment表通过target_type和target_id实现多态关联，避免为帖子评论和课程评论各建一张表。后续如果讲师需要独立管理，可将teacher_name提取为Teacher实体并通过外键关联。</w:t>
+        <w:t xml:space="preserve">上述表结构在设计时遵循第三范式（3NF）要求。每张表的非主键字段都直接依赖于主键，不存在传递依赖。例如Course表中teacher_name虽然描述讲师信息，但在当前系统中讲师不作为独立实体管理，因此不需要拆分为单独的Teacher表。Comment表通过target_type和target_id两个字段实现多态关联，避免了为帖子评论和课程评论各建一张表导致的冗余。如果后续讲师需要独立管理（如个人主页、多课程关联），可将teacher_name提取为Teacher实体并通过外键关联。</w:t>
       </w:r>
       <w:r>
         <w:rPr>
@@ -23575,7 +23655,7 @@
       <w:r>
         <w:drawing>
           <wp:inline xmlns:a="http://schemas.openxmlformats.org/drawingml/2006/main" xmlns:pic="http://schemas.openxmlformats.org/drawingml/2006/picture">
-            <wp:extent cx="4680000" cy="2949468"/>
+            <wp:extent cx="4680000" cy="2406857"/>
             <wp:docPr id="1010" name="Picture 16"/>
             <wp:cNvGraphicFramePr>
               <a:graphicFrameLocks noChangeAspect="1"/>
@@ -23596,7 +23676,7 @@
                   <pic:spPr>
                     <a:xfrm>
                       <a:off x="0" y="0"/>
-                      <a:ext cx="4680000" cy="2949468"/>
+                      <a:ext cx="4680000" cy="2406857"/>
                     </a:xfrm>
                     <a:prstGeom prst="rect"/>
                   </pic:spPr>
@@ -24067,7 +24147,7 @@
       <w:r>
         <w:drawing>
           <wp:inline xmlns:a="http://schemas.openxmlformats.org/drawingml/2006/main" xmlns:pic="http://schemas.openxmlformats.org/drawingml/2006/picture">
-            <wp:extent cx="4680000" cy="2394500"/>
+            <wp:extent cx="4680000" cy="2273143"/>
             <wp:docPr id="1011" name="Picture 16"/>
             <wp:cNvGraphicFramePr>
               <a:graphicFrameLocks noChangeAspect="1"/>
@@ -24088,7 +24168,7 @@
                   <pic:spPr>
                     <a:xfrm>
                       <a:off x="0" y="0"/>
-                      <a:ext cx="4680000" cy="2394500"/>
+                      <a:ext cx="4680000" cy="2273143"/>
                     </a:xfrm>
                     <a:prstGeom prst="rect"/>
                   </pic:spPr>

</xml_diff>

<commit_message>
fix: address 7 reviewer feedback items for zhixue thesis
1. Keywords → Keywords: (one word, capitalized) in shou template
2. Added fig 4-4 reference text linking to enrollment API
3. Added state diagram (course + enrollment status transitions)
4. Expanded cache strategy with Cache-Aside pattern details
5. Fixed duplicate hardware table in ch6
6. Fixed performance test interface list to match table 6-7
7. Replaced references with 16 real ones from bigan.net API
   Also fixed build.py to handle both list and dict refs format

Co-Authored-By: Claude Opus 4.6 (1M context) <noreply@anthropic.com>
</commit_message>
<xml_diff>
--- a/papers/zhixue/output_v2.docx
+++ b/papers/zhixue/output_v2.docx
@@ -354,7 +354,7 @@
           <w:sz w:val="32"/>
           <w:highlight w:val="none"/>
         </w:rPr>
-        <w:t xml:space="preserve">   班 级：计算机科学与技术5班</w:t>
+        <w:t xml:space="preserve">   班 级：软件工程1班</w:t>
       </w:r>
     </w:p>
     <w:p>
@@ -374,7 +374,7 @@
           <w:sz w:val="32"/>
           <w:highlight w:val="none"/>
         </w:rPr>
-        <w:t xml:space="preserve">   姓 名：付凯文</w:t>
+        <w:t xml:space="preserve">   姓 名：韩欣儒</w:t>
       </w:r>
     </w:p>
     <w:p>
@@ -394,7 +394,7 @@
           <w:sz w:val="32"/>
           <w:highlight w:val="none"/>
         </w:rPr>
-        <w:t xml:space="preserve">   学 号：2212100207</w:t>
+        <w:t xml:space="preserve">   学 号：2252337</w:t>
       </w:r>
     </w:p>
     <w:p>

</xml_diff>